<commit_message>
Kirish: III–IV bob natijalari bo'yicha ilmiy yangilik va amaliy natijalar, vazifalar yangilandi
Co-Authored-By: Claude Opus 5.5 <noreply@anthropic.com>
Claude-Session: https://claude.ai/code/session_01PxHTC8Q7yHdrpAeUA5KUgM
</commit_message>
<xml_diff>
--- a/paragraflar/Kirish.docx
+++ b/paragraflar/Kirish.docx
@@ -825,7 +825,7 @@
           <w:rFonts w:ascii="Times New Roman" w:hAnsi="Times New Roman" w:cs="Times New Roman" w:eastAsia="Times New Roman"/>
           <w:sz w:val="28"/>
         </w:rPr>
-        <w:t xml:space="preserve">Dissertatsiya tadqiqoti [oliy ta’lim muassasasi nomi] ilmiy-tadqiqot ishlari rejasiga muvofiq «[ilmiy-tadqiqot mavzusi nomi]» mavzusi doirasida bajarilgan.</w:t>
+        <w:t xml:space="preserve">Dissertatsiya tadqiqoti Denov tadbirkorlik va pedagogika universiteti ilmiy-tadqiqot ishlari rejasiga muvofiq «[ilmiy-tadqiqot mavzusi nomi]» mavzusi doirasida bajarilgan.</w:t>
       </w:r>
     </w:p>
     <w:p>
@@ -993,22 +993,22 @@
           <w:rFonts w:ascii="Times New Roman" w:hAnsi="Times New Roman" w:cs="Times New Roman" w:eastAsia="Times New Roman"/>
           <w:sz w:val="28"/>
         </w:rPr>
-        <w:t xml:space="preserve">moliyaviy barqarorlikni erta ogohlantirish tizimini shakllantirish va uni o‘rta muddatli istiqbolda prognozlash;</w:t>
-      </w:r>
-    </w:p>
-    <w:p>
-      <w:pPr>
-        <w:pStyle w:val="BodyText"/>
-        <w:spacing w:line="360" w:lineRule="auto" w:before="0" w:after="0"/>
-        <w:ind w:firstLine="709"/>
-        <w:jc w:val="both"/>
-      </w:pPr>
-      <w:r>
-        <w:rPr>
-          <w:rFonts w:ascii="Times New Roman" w:hAnsi="Times New Roman" w:cs="Times New Roman" w:eastAsia="Times New Roman"/>
-          <w:sz w:val="28"/>
-        </w:rPr>
-        <w:t xml:space="preserve">tijorat banklari moliyaviy barqarorligini baholash amaliyotini xalqaro standartlarga muvofiqlashtirish bo‘yicha taklif va tavsiyalar ishlab chiqish.</w:t>
+        <w:t xml:space="preserve">integral indeks asosida moliyaviy barqarorlikni erta ogohlantirish tizimini shakllantirish va 2026–2028-yillarga ssenariy prognozini ishlab chiqish;</w:t>
+      </w:r>
+    </w:p>
+    <w:p>
+      <w:pPr>
+        <w:pStyle w:val="BodyText"/>
+        <w:spacing w:line="360" w:lineRule="auto" w:before="0" w:after="0"/>
+        <w:ind w:firstLine="709"/>
+        <w:jc w:val="both"/>
+      </w:pPr>
+      <w:r>
+        <w:rPr>
+          <w:rFonts w:ascii="Times New Roman" w:hAnsi="Times New Roman" w:cs="Times New Roman" w:eastAsia="Times New Roman"/>
+          <w:sz w:val="28"/>
+        </w:rPr>
+        <w:t xml:space="preserve">tijorat banklari moliyaviy barqarorligini baholash tizimini xalqaro standartlarga muvofiqlashtirishning asosiy yo‘nalishlarini ishlab chiqish.</w:t>
       </w:r>
     </w:p>
     <w:p>
@@ -1163,37 +1163,37 @@
           <w:rFonts w:ascii="Times New Roman" w:hAnsi="Times New Roman" w:cs="Times New Roman" w:eastAsia="Times New Roman"/>
           <w:sz w:val="28"/>
         </w:rPr>
-        <w:t xml:space="preserve">MHXS 9 bo‘yicha qadrsizlangan kreditlar ulushining milliy hisobotdagi muammoli kreditlar ulushiga nisbati sifatida «yashirin kredit riski koeffitsiyenti»ni moliyaviy barqarorlikni baholash tizimiga kiritish va uning [__] dan yuqori qiymatini erta ogohlantirish signali sifatida belgilash taklif etilgan;</w:t>
-      </w:r>
-    </w:p>
-    <w:p>
-      <w:pPr>
-        <w:pStyle w:val="BodyText"/>
-        <w:spacing w:line="360" w:lineRule="auto" w:before="0" w:after="0"/>
-        <w:ind w:firstLine="709"/>
-        <w:jc w:val="both"/>
-      </w:pPr>
-      <w:r>
-        <w:rPr>
-          <w:rFonts w:ascii="Times New Roman" w:hAnsi="Times New Roman" w:cs="Times New Roman" w:eastAsia="Times New Roman"/>
-          <w:sz w:val="28"/>
-        </w:rPr>
-        <w:t xml:space="preserve">Bazel III kapital va likvidlik me’yorlari, MHXS 9 bo‘yicha aktivlar sifati va Xalqaro valyuta jamg‘armasi moliyaviy barqarorlik ko‘rsatkichlarini birlashtiruvchi moliyaviy barqarorlik integral indeksi va uning chegaraviy qiymatlari ishlab chiqilgan [3-bob natijalari bo‘yicha aniqlashtiriladi];</w:t>
-      </w:r>
-    </w:p>
-    <w:p>
-      <w:pPr>
-        <w:pStyle w:val="BodyText"/>
-        <w:spacing w:line="360" w:lineRule="auto" w:before="0" w:after="0"/>
-        <w:ind w:firstLine="709"/>
-        <w:jc w:val="both"/>
-      </w:pPr>
-      <w:r>
-        <w:rPr>
-          <w:rFonts w:ascii="Times New Roman" w:hAnsi="Times New Roman" w:cs="Times New Roman" w:eastAsia="Times New Roman"/>
-          <w:sz w:val="28"/>
-        </w:rPr>
-        <w:t xml:space="preserve">[4-bob natijalari bo‘yicha: erta ogohlantirish tizimi yoki prognoz modeli bo‘yicha ilmiy yangilik].</w:t>
+        <w:t xml:space="preserve">MHXS 9 bo‘yicha qadrsizlangan kreditlar ulushining milliy hisobotdagi muammoli kreditlar ulushiga nisbati sifatida «yashirin kredit riski koeffitsiyenti» taklif etilgan va undan milliy hisobot ma’lumotlarini xalqaro standartlar darajasiga keltirib, integral indeksning aktivlar sifati blokini tuzatish vositasi sifatida foydalanish asoslangan (koeffitsiyent tahlil qilingan banklarda 1,7–5,6 ni tashkil etgan);</w:t>
+      </w:r>
+    </w:p>
+    <w:p>
+      <w:pPr>
+        <w:pStyle w:val="BodyText"/>
+        <w:spacing w:line="360" w:lineRule="auto" w:before="0" w:after="0"/>
+        <w:ind w:firstLine="709"/>
+        <w:jc w:val="both"/>
+      </w:pPr>
+      <w:r>
+        <w:rPr>
+          <w:rFonts w:ascii="Times New Roman" w:hAnsi="Times New Roman" w:cs="Times New Roman" w:eastAsia="Times New Roman"/>
+          <w:sz w:val="28"/>
+        </w:rPr>
+        <w:t xml:space="preserve">Bazel III kapital va likvidlik me’yorlari, MHXS 9 bo‘yicha aktivlar sifati va Xalqaro valyuta jamg‘armasi moliyaviy barqarorlik ko‘rsatkichlarini birlashtiruvchi besh blokli moliyaviy barqarorlik integral indeksi, uning 1–4 ballik shkalasi va to‘rtta barqarorlik sinfi chegaralari ishlab chiqilgan hamda indeks davlat banklari uchun davlat ko‘magisiz variantda hisoblanib, davlat ko‘magining baholashga ta’siri ajratilgan;</w:t>
+      </w:r>
+    </w:p>
+    <w:p>
+      <w:pPr>
+        <w:pStyle w:val="BodyText"/>
+        <w:spacing w:line="360" w:lineRule="auto" w:before="0" w:after="0"/>
+        <w:ind w:firstLine="709"/>
+        <w:jc w:val="both"/>
+      </w:pPr>
+      <w:r>
+        <w:rPr>
+          <w:rFonts w:ascii="Times New Roman" w:hAnsi="Times New Roman" w:cs="Times New Roman" w:eastAsia="Times New Roman"/>
+          <w:sz w:val="28"/>
+        </w:rPr>
+        <w:t xml:space="preserve">integral indeksga asoslangan uch zonali erta ogohlantirish tizimi ishlab chiqilgan va indeksning tijorat banklarida moliyaviy muammolarni to‘rt chorak oldin bashorat qilish kuchi (AUC = 0,86) an’anaviy Z-score ko‘rsatkichidan (AUC = 0,42) yuqori ekani empirik jihatdan isbotlangan.</w:t>
       </w:r>
     </w:p>
     <w:p>
@@ -1270,7 +1270,7 @@
           <w:rFonts w:ascii="Times New Roman" w:hAnsi="Times New Roman" w:cs="Times New Roman" w:eastAsia="Times New Roman"/>
           <w:sz w:val="28"/>
         </w:rPr>
-        <w:t xml:space="preserve">Markaziy bankning 2709-son nizomi bo‘yicha sof barqaror moliyalashtirish me’yori hisob-kitobida barqaror moliyalashtirish manbai sifatida regulyativ kapital o‘rniga xususiy kapital olinishi me’yorni [__] foiz punktga o‘zgartirishi aniqlanib, hisoblash tartibini aniqlashtirish taklif etilgan;</w:t>
+        <w:t xml:space="preserve">Markaziy bankning 2709-son nizomi bo‘yicha sof barqaror moliyalashtirish me’yori hisob-kitobida barqaror moliyalashtirish manbai sifatida regulyativ kapital o‘rniga xususiy kapital olinishi me’yorni taxminan 7,2 foiz punktga oshirishi aniqlanib, hisoblash tartibini aniqlashtirish taklif etilgan;</w:t>
       </w:r>
     </w:p>
     <w:p>
@@ -1300,7 +1300,52 @@
           <w:rFonts w:ascii="Times New Roman" w:hAnsi="Times New Roman" w:cs="Times New Roman" w:eastAsia="Times New Roman"/>
           <w:sz w:val="28"/>
         </w:rPr>
-        <w:t xml:space="preserve">[3–4-boblar natijalari bo‘yicha: integral indeks asosida banklar reytingi, erta ogohlantirish tizimi va 2026–2028-yillarga prognoz natijalari].</w:t>
+        <w:t xml:space="preserve">beshta yirik bank MHXS hisobotlari asosida integral indeks bo‘yicha reyting baholanib, davlat ko‘magisiz baholashda «Mikrokreditbank» ATB ning indeksi 2,47 balldan 1,72 ballgacha, ya’ni nobarqaror sinfgacha pasayishi aniqlangan;</w:t>
+      </w:r>
+    </w:p>
+    <w:p>
+      <w:pPr>
+        <w:pStyle w:val="BodyText"/>
+        <w:spacing w:line="360" w:lineRule="auto" w:before="0" w:after="0"/>
+        <w:ind w:firstLine="709"/>
+        <w:jc w:val="both"/>
+      </w:pPr>
+      <w:r>
+        <w:rPr>
+          <w:rFonts w:ascii="Times New Roman" w:hAnsi="Times New Roman" w:cs="Times New Roman" w:eastAsia="Times New Roman"/>
+          <w:sz w:val="28"/>
+        </w:rPr>
+        <w:t xml:space="preserve">25 ta tijorat banki bo‘yicha 2021–2025-yillardagi choraklik panel ma’lumotlari asosida davlat banklarining integral indeksi xususiy banklarnikidan o‘rtacha 0,69 ballga past ekani, bu farqning qariyb yarmi depozit bazasining torligi va past foiz marjasi bilan izohlanishi aniqlangan;</w:t>
+      </w:r>
+    </w:p>
+    <w:p>
+      <w:pPr>
+        <w:pStyle w:val="BodyText"/>
+        <w:spacing w:line="360" w:lineRule="auto" w:before="0" w:after="0"/>
+        <w:ind w:firstLine="709"/>
+        <w:jc w:val="both"/>
+      </w:pPr>
+      <w:r>
+        <w:rPr>
+          <w:rFonts w:ascii="Times New Roman" w:hAnsi="Times New Roman" w:cs="Times New Roman" w:eastAsia="Times New Roman"/>
+          <w:sz w:val="28"/>
+        </w:rPr>
+        <w:t xml:space="preserve">2026–2028-yillarga shartli ssenariy prognozi asosida 2020-yildagi kabi keskin iqtisodiy shok takrorlangan taqdirda 2027-yilda tizim aktivlarining 24,3 foizini tashkil etuvchi to‘rtta davlat banki qizil zonaga tushishi, «O‘zsanoatqurilishbank» ATB esa milliy hisobot bo‘yicha barqaror ko‘rinsa-da, MHXS bo‘yicha qizil zonaga tushishi ko‘rsatilgan;</w:t>
+      </w:r>
+    </w:p>
+    <w:p>
+      <w:pPr>
+        <w:pStyle w:val="BodyText"/>
+        <w:spacing w:line="360" w:lineRule="auto" w:before="0" w:after="0"/>
+        <w:ind w:firstLine="709"/>
+        <w:jc w:val="both"/>
+      </w:pPr>
+      <w:r>
+        <w:rPr>
+          <w:rFonts w:ascii="Times New Roman" w:hAnsi="Times New Roman" w:cs="Times New Roman" w:eastAsia="Times New Roman"/>
+          <w:sz w:val="28"/>
+        </w:rPr>
+        <w:t xml:space="preserve">FSAP tavsiyalari va Markaziy bankning 2025–2028-yillarga mo‘ljallangan «yo‘l xaritasi» bilan muvofiqlashtirilgan holda integral indeksni masofaviy monitoringga joriy etish, unga asoslangan erta ogohlantirish va tezkor tuzatish choralari tizimini shakllantirish hamda stress-testlarni MHXS ma’lumotlari asosida o‘tkazish bo‘yicha takliflar ishlab chiqilgan.</w:t>
       </w:r>
     </w:p>
     <w:p>

</xml_diff>

<commit_message>
Kirish: joriy etish bandlari yangi yondashuvga moslashtirildi
Co-Authored-By: Claude Opus 5.5 <noreply@anthropic.com>
Claude-Session: https://claude.ai/code/session_01PxHTC8Q7yHdrpAeUA5KUgM
</commit_message>
<xml_diff>
--- a/paragraflar/Kirish.docx
+++ b/paragraflar/Kirish.docx
@@ -1498,22 +1498,37 @@
           <w:rFonts w:ascii="Times New Roman" w:hAnsi="Times New Roman" w:cs="Times New Roman" w:eastAsia="Times New Roman"/>
           <w:sz w:val="28"/>
         </w:rPr>
-        <w:t xml:space="preserve">«yashirin kredit riski koeffitsiyenti»ni moliyaviy barqarorlikni baholash tizimiga kiritish va uning chegaraviy qiymatini erta ogohlantirish signali sifatida belgilash taklifi «O‘zsanoatqurilishbank» ATB amaliyotida foydalanilgan («O‘zsanoatqurilishbank» ATB ning 2026-yil 8-oktabrdagi 22156/56-son ma’lumotnomasi). Ushbu taklifning amaliyotga joriy etilishi natijasida bank kredit portfeli sifatini milliy tasnif va MHXS 9 bosqichlari bo‘yicha birgalikda monitoring qilish imkoniyati yaratildi;</w:t>
-      </w:r>
-    </w:p>
-    <w:p>
-      <w:pPr>
-        <w:pStyle w:val="BodyText"/>
-        <w:spacing w:line="360" w:lineRule="auto" w:before="0" w:after="0"/>
-        <w:ind w:firstLine="709"/>
-        <w:jc w:val="both"/>
-      </w:pPr>
-      <w:r>
-        <w:rPr>
-          <w:rFonts w:ascii="Times New Roman" w:hAnsi="Times New Roman" w:cs="Times New Roman" w:eastAsia="Times New Roman"/>
-          <w:sz w:val="28"/>
-        </w:rPr>
-        <w:t xml:space="preserve">moliyaviy barqarorlik integral indeksi va uning chegaraviy qiymatlari taklifi «O‘zsanoatqurilishbank» ATB amaliyotida foydalanilgan («O‘zsanoatqurilishbank» ATB ning 2026-yil 8-oktabrdagi 22156/56-son ma’lumotnomasi). Ushbu taklifning amaliyotga joriy etilishi natijasida bank moliyaviy barqarorligini yagona ko‘rsatkich asosida kompleks baholash imkoniyati yaratildi.</w:t>
+        <w:t xml:space="preserve">«yashirin kredit riski koeffitsiyenti» yordamida milliy hisobot asosidagi muammoli kreditlar ko‘rsatkichini MHXS 9 darajasiga keltirib, integral indeksning aktivlar sifati blokini tuzatish taklifi «O‘zsanoatqurilishbank» ATB amaliyotida foydalanilgan («O‘zsanoatqurilishbank» ATB ning 2026-yil 8-oktabrdagi 22156/56-son ma’lumotnomasi). Ushbu taklifning amaliyotga joriy etilishi natijasida bank kredit portfeli sifatini milliy tasnif va MHXS 9 bosqichlari bo‘yicha birgalikda monitoring qilish imkoniyati yaratildi;</w:t>
+      </w:r>
+    </w:p>
+    <w:p>
+      <w:pPr>
+        <w:pStyle w:val="BodyText"/>
+        <w:spacing w:line="360" w:lineRule="auto" w:before="0" w:after="0"/>
+        <w:ind w:firstLine="709"/>
+        <w:jc w:val="both"/>
+      </w:pPr>
+      <w:r>
+        <w:rPr>
+          <w:rFonts w:ascii="Times New Roman" w:hAnsi="Times New Roman" w:cs="Times New Roman" w:eastAsia="Times New Roman"/>
+          <w:sz w:val="28"/>
+        </w:rPr>
+        <w:t xml:space="preserve">moliyaviy barqarorlik integral indeksi va uning chegaraviy qiymatlari taklifi «O‘zsanoatqurilishbank» ATB amaliyotida foydalanilgan («O‘zsanoatqurilishbank» ATB ning 2026-yil 8-oktabrdagi 22156/56-son ma’lumotnomasi). Ushbu taklifning amaliyotga joriy etilishi natijasida bank moliyaviy barqarorligini yagona ko‘rsatkich asosida kompleks baholash imkoniyati yaratildi;</w:t>
+      </w:r>
+    </w:p>
+    <w:p>
+      <w:pPr>
+        <w:pStyle w:val="BodyText"/>
+        <w:spacing w:line="360" w:lineRule="auto" w:before="0" w:after="0"/>
+        <w:ind w:firstLine="709"/>
+        <w:jc w:val="both"/>
+      </w:pPr>
+      <w:r>
+        <w:rPr>
+          <w:rFonts w:ascii="Times New Roman" w:hAnsi="Times New Roman" w:cs="Times New Roman" w:eastAsia="Times New Roman"/>
+          <w:sz w:val="28"/>
+        </w:rPr>
+        <w:t xml:space="preserve">integral indeksga asoslangan uch zonali erta ogohlantirish tizimi va uni stress-test natijalari bilan bog‘lash taklifi «O‘zsanoatqurilishbank» ATB amaliyotida foydalanilgan («O‘zsanoatqurilishbank» ATB ning 2026-yil 8-oktabrdagi 22156/56-son ma’lumotnomasi). Ushbu taklifning amaliyotga joriy etilishi natijasida bankda moliyaviy barqarorlikning yomonlashuvini zarar sifatida namoyon bo‘lishidan oldin aniqlash va risk-appetit doirasida tuzatish choralarini o‘z vaqtida ko‘rish imkoniyati yaratildi.</w:t>
       </w:r>
     </w:p>
     <w:p>

</xml_diff>